<commit_message>
feat(core): add classic Dijkstra shortest paths and refuge topologies
</commit_message>
<xml_diff>
--- a/docs/DOC_01_Visao_Objetivos_Escopo_TSP.docx
+++ b/docs/DOC_01_Visao_Objetivos_Escopo_TSP.docx
@@ -3761,6 +3761,56 @@
         <w:t>JUnit. Documentação oficial e JUnit Jupiter 5.14.3.</w:t>
       </w:r>
     </w:p>
+    <w:p>
+      <w:r>
+        <w:t xml:space="preserve">Revisão de escopo acadêmico — 19/10/2026 (após a PR #34)</w:t>
+      </w:r>
+    </w:p>
+    <w:p>
+      <w:r>
+        <w:t xml:space="preserve">Decisão aprovada: dois problemas distintos. Força bruta e backtracking continuam resolvendo o TSP: ciclo hamiltoniano mínimo que visita todas as cidades e retorna à origem 0. Dijkstra clássico resolve caminhos mínimos entre refúgios, de uma origem aos destinos alcançáveis. Um caminho de Dijkstra não é uma solução do TSP.</w:t>
+      </w:r>
+    </w:p>
+    <w:p>
+      <w:r>
+        <w:t xml:space="preserve">Esta revisão acrescenta a nova exigência e substitui a exclusão anterior de Dijkstra no escopo geral, preservando o histórico e todos os contratos matemáticos do TSP. Não foi implementado Dijkstra sobre máscaras ou estados expandidos do TSP.</w:t>
+      </w:r>
+    </w:p>
+    <w:p>
+      <w:r>
+        <w:t xml:space="preserve">RefugeTopology define conexões disponíveis; RefugeGraph usa os mesmos índices e exatamente TspProblem.cost(u,v) em cada conexão. Há topologia completa implícita, esparsa conectada reproduzível por seed e manual inclusive desconectada. A matriz original não é alterada e o terreno não define custos.</w:t>
+      </w:r>
+    </w:p>
+    <w:p>
+      <w:r>
+        <w:t xml:space="preserve">DijkstraShortestPathSolver possui heap indexado, extração por menor distância, fixação definitiva, relaxamento e predecessores. Distâncias e somas são BigInteger, incluindo resultados acima de Long.MAX_VALUE. Ausência de conexão/distância é explícita. ShortestPathResult é separado de TspResult e de TspSolver.</w:t>
+      </w:r>
+    </w:p>
+    <w:p>
+      <w:r>
+        <w:t xml:space="preserve">Desempate determinístico: fila por distância e índice, vizinhos crescentes, igualdade preserva predecessor. Não se promete caminho lexicograficamente mínimo. A ordem de fixação diminui seguindo predecessores, impedindo ciclos inclusive com pesos zero.</w:t>
+      </w:r>
+    </w:p>
+    <w:p>
+      <w:r>
+        <w:t xml:space="preserve">Somente distâncias fixadas são CONFIRMADO. Interrupções preservam apenas confirmações; rótulos tentativos são omitidos. INALCANCAVEL exige busca CONCLUIDO. CANCELADO, LIMITE_ATINGIDO e ERRO são distintos e possuem motivo. Limites de vértices, entradas examinadas e tempo são cooperativos.</w:t>
+      </w:r>
+    </w:p>
+    <w:p>
+      <w:r>
+        <w:t xml:space="preserve">Complexidade: força bruta e backtracking têm pior caso O(N*(N-1)!) e espaço auxiliar O(N). Dijkstra com heap indexado usa O((V+E)*log V) operações aritméticas e O(V) espaço auxiliar. BigInteger depende dos bits das distâncias. A topologia explícita ocupa O(V+E) e a matriz existente permanece O(V²). Estimativas de memória não são reservas nem limites reais de heap.</w:t>
+      </w:r>
+    </w:p>
+    <w:p>
+      <w:r>
+        <w:t xml:space="preserve">A auditoria independente usa Floyd–Warshall exclusivamente nos testes, com matrizes manuais, custos zero, empates, desconexões, extremos long, resultados BigInteger, interrupções, limites exatos e reprodução. O baseline TSP permanece preservado.</w:t>
+      </w:r>
+    </w:p>
+    <w:p>
+      <w:r>
+        <w:t xml:space="preserve">Entregas: PR A — núcleo de caminhos mínimos, contratos, testes e documentação; PR B — issue #12, painel assíncrono e adaptação 3D/2D; PR C — issue #13, validação e demonstração acadêmica. A PR A não implementa o painel. Detalhes normativos atuais, métricas, limites e comandos: docs/CAMINHOS_MINIMOS.md.</w:t>
+      </w:r>
+    </w:p>
     <w:sectPr>
       <w:footerReference w:type="default" r:id="rId9"/>
       <w:footerReference w:type="first" r:id="rId10"/>

</xml_diff>

<commit_message>
feat(app): add asynchronous operational TSP and shortest-path panel
</commit_message>
<xml_diff>
--- a/docs/DOC_01_Visao_Objetivos_Escopo_TSP.docx
+++ b/docs/DOC_01_Visao_Objetivos_Escopo_TSP.docx
@@ -3811,6 +3811,36 @@
         <w:t xml:space="preserve">Entregas: PR A — núcleo de caminhos mínimos, contratos, testes e documentação; PR B — issue #12, painel assíncrono e adaptação 3D/2D; PR C — issue #13, validação e demonstração acadêmica. A PR A não implementa o painel. Detalhes normativos atuais, métricas, limites e comandos: docs/CAMINHOS_MINIMOS.md.</w:t>
       </w:r>
     </w:p>
+    <w:p>
+      <w:r>
+        <w:t>Integração operacional — issue #12 — 19/10/2026</w:t>
+      </w:r>
+    </w:p>
+    <w:p>
+      <w:r>
+        <w:t>O painel passa a gerar instâncias por N/seed e executar força bruta, backtracking ou Dijkstra clássico em tarefas assíncronas. A mesma instância imutável pode ser reutilizada; presets N=3/5/8/12 permanecem disponíveis. Esta extensão não altera a matemática do TSP nem os solvers auditados.</w:t>
+      </w:r>
+    </w:p>
+    <w:p>
+      <w:r>
+        <w:t>TSP continua produzindo ciclo hamiltoniano com retorno à origem 0. Dijkstra clássico produz caminhos mínimos sobre topologia completa ou esparsa conectada, com custos da matriz original. Sua origem/destino e suas distâncias BigInteger têm apresentação própria; não constituem um ciclo do caixeiro-viajante.</w:t>
+      </w:r>
+    </w:p>
+    <w:p>
+      <w:r>
+        <w:t>Geração, busca e preparação visual têm etapas e cancelamentos distintos. Cancelar busca preserva o retorno cooperativo do núcleo: incumbente TSP ou distâncias Dijkstra confirmadas. Identidades de instância/execução e revisões de apresentação impedem entregas antigas. Interrupções nunca certificam ótimo TSP; destino inalcançável só é declarado por busca concluída.</w:t>
+      </w:r>
+    </w:p>
+    <w:p>
+      <w:r>
+        <w:t>O preflight informa recursos e limites reais; métricas opcionais ausentes são não informado. O mundo 3D/2D compartilha geometria e mantém câmera/seleção ao atualizar respostas da mesma instância. Filtragem de conexões é somente visual e não altera o grafo. Complexidade e contratos acadêmicos anteriores permanecem vigentes.</w:t>
+      </w:r>
+    </w:p>
+    <w:p>
+      <w:r>
+        <w:t>Ver docs/PAINEL_OPERACIONAL.md para operação, arquitetura, testes e orçamentos. Capturas Fedora por controles automatizados são evidência de execução real, separada de fixtures e de revisão manual. Entrada nativa via Robot permanece inconclusiva no Wayland disponível; homologação acadêmica completa da issue #13 não é declarada nesta entrega.</w:t>
+      </w:r>
+    </w:p>
     <w:sectPr>
       <w:footerReference w:type="default" r:id="rId9"/>
       <w:footerReference w:type="first" r:id="rId10"/>

</xml_diff>